<commit_message>
thêm lệnh docker redis insight và ví dụ nhanh về chức năng login
</commit_message>
<xml_diff>
--- a/ecommerce-project/Hệ Thống Phân Tán của Chợ Việt.docx
+++ b/ecommerce-project/Hệ Thống Phân Tán của Chợ Việt.docx
@@ -3123,6 +3123,41 @@
           <w:szCs w:val="24"/>
           <w:lang w:val="en-US"/>
         </w:rPr>
+        <w:t xml:space="preserve">RedisInsight: </w:t>
+      </w:r>
+      <w:r>
+        <w:rPr>
+          <w:rFonts w:ascii="Arial" w:hAnsi="Arial" w:cs="Arial"/>
+          <w:sz w:val="24"/>
+          <w:szCs w:val="24"/>
+          <w:lang w:val="en-US"/>
+        </w:rPr>
+        <w:t>docker run -d --name redisinsight -p 5540:5540 redis/redisinsight:latest -v redisinsight:/data</w:t>
+      </w:r>
+    </w:p>
+    <w:p>
+      <w:pPr>
+        <w:pStyle w:val="ListParagraph"/>
+        <w:numPr>
+          <w:ilvl w:val="1"/>
+          <w:numId w:val="1"/>
+        </w:numPr>
+        <w:rPr>
+          <w:rFonts w:ascii="Arial" w:hAnsi="Arial" w:cs="Arial"/>
+          <w:sz w:val="24"/>
+          <w:szCs w:val="24"/>
+          <w:lang w:val="en-US"/>
+        </w:rPr>
+      </w:pPr>
+      <w:r>
+        <w:rPr>
+          <w:rFonts w:ascii="Arial" w:hAnsi="Arial" w:cs="Arial"/>
+          <w:b/>
+          <w:bCs/>
+          <w:sz w:val="24"/>
+          <w:szCs w:val="24"/>
+          <w:lang w:val="en-US"/>
+        </w:rPr>
         <w:t>MySQL</w:t>
       </w:r>
       <w:r>
@@ -3505,25 +3540,17 @@
           <w:szCs w:val="24"/>
           <w:lang w:val="en-US"/>
         </w:rPr>
-        <w:t>B1: Chạy service discovery</w:t>
-      </w:r>
-      <w:r>
-        <w:rPr>
-          <w:rFonts w:ascii="Arial" w:hAnsi="Arial" w:cs="Arial"/>
-          <w:sz w:val="24"/>
-          <w:szCs w:val="24"/>
-          <w:lang w:val="en-US"/>
-        </w:rPr>
-        <w:t>.</w:t>
-      </w:r>
-      <w:r>
-        <w:rPr>
-          <w:rFonts w:ascii="Arial" w:hAnsi="Arial" w:cs="Arial"/>
-          <w:sz w:val="24"/>
-          <w:szCs w:val="24"/>
-          <w:lang w:val="en-US"/>
-        </w:rPr>
-        <w:t xml:space="preserve"> </w:t>
+        <w:lastRenderedPageBreak/>
+        <w:t xml:space="preserve">B1: </w:t>
+      </w:r>
+      <w:r>
+        <w:rPr>
+          <w:rFonts w:ascii="Arial" w:hAnsi="Arial" w:cs="Arial"/>
+          <w:sz w:val="24"/>
+          <w:szCs w:val="24"/>
+          <w:lang w:val="en-US"/>
+        </w:rPr>
+        <w:t>Khởi động Service Discovery trước để các microservices đăng ký.</w:t>
       </w:r>
     </w:p>
     <w:p>
@@ -3585,16 +3612,52 @@
           <w:szCs w:val="24"/>
           <w:lang w:val="en-US"/>
         </w:rPr>
-        <w:t xml:space="preserve"> trong CMD</w:t>
-      </w:r>
-      <w:r>
-        <w:rPr>
-          <w:rFonts w:ascii="Arial" w:hAnsi="Arial" w:cs="Arial"/>
-          <w:sz w:val="24"/>
-          <w:szCs w:val="24"/>
-          <w:lang w:val="en-US"/>
-        </w:rPr>
-        <w:t>.</w:t>
+        <w:t xml:space="preserve"> trong CM</w:t>
+      </w:r>
+      <w:r>
+        <w:rPr>
+          <w:rFonts w:ascii="Arial" w:hAnsi="Arial" w:cs="Arial"/>
+          <w:sz w:val="24"/>
+          <w:szCs w:val="24"/>
+          <w:lang w:val="en-US"/>
+        </w:rPr>
+        <w:t>D(Nếu chạy lệnh thì tự động chạy container). Nếu c</w:t>
+      </w:r>
+      <w:r>
+        <w:rPr>
+          <w:rFonts w:ascii="Arial" w:hAnsi="Arial" w:cs="Arial"/>
+          <w:sz w:val="24"/>
+          <w:szCs w:val="24"/>
+          <w:lang w:val="en-US"/>
+        </w:rPr>
+        <w:t>hạy</w:t>
+      </w:r>
+      <w:r>
+        <w:rPr>
+          <w:rFonts w:ascii="Arial" w:hAnsi="Arial" w:cs="Arial"/>
+          <w:sz w:val="24"/>
+          <w:szCs w:val="24"/>
+          <w:lang w:val="en-US"/>
+        </w:rPr>
+        <w:t xml:space="preserve"> bằng tay</w:t>
+      </w:r>
+      <w:r>
+        <w:rPr>
+          <w:rFonts w:ascii="Arial" w:hAnsi="Arial" w:cs="Arial"/>
+          <w:sz w:val="24"/>
+          <w:szCs w:val="24"/>
+          <w:lang w:val="en-US"/>
+        </w:rPr>
+        <w:t xml:space="preserve"> thì chạy</w:t>
+      </w:r>
+      <w:r>
+        <w:rPr>
+          <w:rFonts w:ascii="Arial" w:hAnsi="Arial" w:cs="Arial"/>
+          <w:sz w:val="24"/>
+          <w:szCs w:val="24"/>
+          <w:lang w:val="en-US"/>
+        </w:rPr>
+        <w:t xml:space="preserve"> các container Docker (MySQL, Redis, MongoDB, RabbitMQ, Elasticsearch, PostgreSQL).</w:t>
       </w:r>
     </w:p>
     <w:p>
@@ -3620,7 +3683,6 @@
           <w:szCs w:val="24"/>
           <w:lang w:val="en-US"/>
         </w:rPr>
-        <w:lastRenderedPageBreak/>
         <w:t>B3: Chạy các microservice còn lại</w:t>
       </w:r>
       <w:r>

</xml_diff>

<commit_message>
thay đổi kiến trúc dự án hoàn thành
</commit_message>
<xml_diff>
--- a/ecommerce-project/Hệ Thống Phân Tán của Chợ Việt.docx
+++ b/ecommerce-project/Hệ Thống Phân Tán của Chợ Việt.docx
@@ -3559,7 +3559,115 @@
           <w:szCs w:val="24"/>
           <w:lang w:val="en-US"/>
         </w:rPr>
-        <w:t>: docker run -d --name postgres_container -p 5432:5432 -e POSTGRES_PASSWORD=</w:t>
+        <w:t xml:space="preserve">: </w:t>
+      </w:r>
+      <w:r>
+        <w:rPr>
+          <w:rFonts w:ascii="Arial" w:hAnsi="Arial" w:cs="Arial"/>
+          <w:sz w:val="24"/>
+          <w:szCs w:val="24"/>
+          <w:lang w:val="en-US"/>
+        </w:rPr>
+        <w:t>docker run -d --name postgres_container -p 5432:5432 -e POSTGRES_USER=</w:t>
+      </w:r>
+      <w:r>
+        <w:rPr>
+          <w:rFonts w:ascii="Arial" w:hAnsi="Arial" w:cs="Arial"/>
+          <w:sz w:val="24"/>
+          <w:szCs w:val="24"/>
+          <w:lang w:val="en-US"/>
+        </w:rPr>
+        <w:t>admin</w:t>
+      </w:r>
+      <w:r>
+        <w:rPr>
+          <w:rFonts w:ascii="Arial" w:hAnsi="Arial" w:cs="Arial"/>
+          <w:sz w:val="24"/>
+          <w:szCs w:val="24"/>
+          <w:lang w:val="en-US"/>
+        </w:rPr>
+        <w:t xml:space="preserve"> -e POSTGRES_PASSWORD=</w:t>
+      </w:r>
+      <w:r>
+        <w:rPr>
+          <w:rFonts w:ascii="Arial" w:hAnsi="Arial" w:cs="Arial"/>
+          <w:sz w:val="24"/>
+          <w:szCs w:val="24"/>
+          <w:lang w:val="en-US"/>
+        </w:rPr>
+        <w:t>chovietluon,a</w:t>
+      </w:r>
+      <w:r>
+        <w:rPr>
+          <w:rFonts w:ascii="Arial" w:hAnsi="Arial" w:cs="Arial"/>
+          <w:sz w:val="24"/>
+          <w:szCs w:val="24"/>
+          <w:lang w:val="en-US"/>
+        </w:rPr>
+        <w:t xml:space="preserve"> postgres:latest</w:t>
+      </w:r>
+    </w:p>
+    <w:p>
+      <w:pPr>
+        <w:pStyle w:val="ListParagraph"/>
+        <w:numPr>
+          <w:ilvl w:val="1"/>
+          <w:numId w:val="1"/>
+        </w:numPr>
+        <w:rPr>
+          <w:rFonts w:ascii="Arial" w:hAnsi="Arial" w:cs="Arial"/>
+          <w:sz w:val="24"/>
+          <w:szCs w:val="24"/>
+          <w:lang w:val="en-US"/>
+        </w:rPr>
+      </w:pPr>
+      <w:r>
+        <w:rPr>
+          <w:rFonts w:ascii="Arial" w:hAnsi="Arial" w:cs="Arial"/>
+          <w:b/>
+          <w:bCs/>
+          <w:sz w:val="24"/>
+          <w:szCs w:val="24"/>
+          <w:lang w:val="en-US"/>
+        </w:rPr>
+        <w:lastRenderedPageBreak/>
+        <w:t>RabbitMQ</w:t>
+      </w:r>
+      <w:r>
+        <w:rPr>
+          <w:rFonts w:ascii="Arial" w:hAnsi="Arial" w:cs="Arial"/>
+          <w:sz w:val="24"/>
+          <w:szCs w:val="24"/>
+          <w:lang w:val="en-US"/>
+        </w:rPr>
+        <w:t xml:space="preserve">: </w:t>
+      </w:r>
+      <w:r>
+        <w:rPr>
+          <w:rFonts w:ascii="Arial" w:hAnsi="Arial" w:cs="Arial"/>
+          <w:sz w:val="24"/>
+          <w:szCs w:val="24"/>
+          <w:lang w:val="en-US"/>
+        </w:rPr>
+        <w:t>docker run -d --name rabbitmq_container -p 5672:5672 -p 15672:15672 -e RABBITMQ_DEFAULT_USER=</w:t>
+      </w:r>
+      <w:r>
+        <w:rPr>
+          <w:rFonts w:ascii="Arial" w:hAnsi="Arial" w:cs="Arial"/>
+          <w:sz w:val="24"/>
+          <w:szCs w:val="24"/>
+          <w:lang w:val="en-US"/>
+        </w:rPr>
+        <w:t>admin</w:t>
+      </w:r>
+      <w:r>
+        <w:rPr>
+          <w:rFonts w:ascii="Arial" w:hAnsi="Arial" w:cs="Arial"/>
+          <w:sz w:val="24"/>
+          <w:szCs w:val="24"/>
+          <w:lang w:val="en-US"/>
+        </w:rPr>
+        <w:t xml:space="preserve"> -e RABBITMQ_DEFAULT_PASS=</w:t>
       </w:r>
       <w:r>
         <w:rPr>
@@ -3577,25 +3685,7 @@
           <w:szCs w:val="24"/>
           <w:lang w:val="en-US"/>
         </w:rPr>
-        <w:t xml:space="preserve"> </w:t>
-      </w:r>
-      <w:r>
-        <w:rPr>
-          <w:rFonts w:ascii="Arial" w:hAnsi="Arial" w:cs="Arial"/>
-          <w:sz w:val="24"/>
-          <w:szCs w:val="24"/>
-          <w:lang w:val="en-US"/>
-        </w:rPr>
-        <w:t>postgres:latest</w:t>
-      </w:r>
-      <w:r>
-        <w:rPr>
-          <w:rFonts w:ascii="Arial" w:hAnsi="Arial" w:cs="Arial"/>
-          <w:sz w:val="24"/>
-          <w:szCs w:val="24"/>
-          <w:lang w:val="en-US"/>
-        </w:rPr>
-        <w:t>.</w:t>
+        <w:t xml:space="preserve"> rabbitmq:3-management</w:t>
       </w:r>
     </w:p>
     <w:p>
@@ -3621,51 +3711,6 @@
           <w:szCs w:val="24"/>
           <w:lang w:val="en-US"/>
         </w:rPr>
-        <w:t>RabbitMQ</w:t>
-      </w:r>
-      <w:r>
-        <w:rPr>
-          <w:rFonts w:ascii="Arial" w:hAnsi="Arial" w:cs="Arial"/>
-          <w:sz w:val="24"/>
-          <w:szCs w:val="24"/>
-          <w:lang w:val="en-US"/>
-        </w:rPr>
-        <w:t>: docker run -d --name rabbitmq_container -p 5672:5672 -p 15672:15672 rabbitmq:3-management</w:t>
-      </w:r>
-      <w:r>
-        <w:rPr>
-          <w:rFonts w:ascii="Arial" w:hAnsi="Arial" w:cs="Arial"/>
-          <w:sz w:val="24"/>
-          <w:szCs w:val="24"/>
-          <w:lang w:val="en-US"/>
-        </w:rPr>
-        <w:t>.</w:t>
-      </w:r>
-    </w:p>
-    <w:p>
-      <w:pPr>
-        <w:pStyle w:val="ListParagraph"/>
-        <w:numPr>
-          <w:ilvl w:val="1"/>
-          <w:numId w:val="1"/>
-        </w:numPr>
-        <w:rPr>
-          <w:rFonts w:ascii="Arial" w:hAnsi="Arial" w:cs="Arial"/>
-          <w:sz w:val="24"/>
-          <w:szCs w:val="24"/>
-          <w:lang w:val="en-US"/>
-        </w:rPr>
-      </w:pPr>
-      <w:r>
-        <w:rPr>
-          <w:rFonts w:ascii="Arial" w:hAnsi="Arial" w:cs="Arial"/>
-          <w:b/>
-          <w:bCs/>
-          <w:sz w:val="24"/>
-          <w:szCs w:val="24"/>
-          <w:lang w:val="en-US"/>
-        </w:rPr>
-        <w:lastRenderedPageBreak/>
         <w:t>ElasticSearch</w:t>
       </w:r>
       <w:r>

</xml_diff>